<commit_message>
Add ABSA/CORM/Rental projects and site updates
Add new project pages and media (ABSA pipeline, CORM, rental property manager) and multiple project images; add Instagram social icon. Update CV to feature projects and adjust tags (add Typescript, Expo, NLP, etc.). Replace Fiverr link with Instagram and bump site copyright to 2026 across pages. Introduce CSS for spoilers and centered video wrapper, refine minor layout styles, and expand llms.txt with new project descriptions and updated skill lists. Also normalize language tags from "C/C++" to "C" and update project cards on index/projects pages.
</commit_message>
<xml_diff>
--- a/assets/files/Amen_Allah_Ben_Aissa_CV.docx
+++ b/assets/files/Amen_Allah_Ben_Aissa_CV.docx
@@ -149,120 +149,6 @@
           <w:i w:val="0"/>
         </w:rPr>
         <w:t>I'm a software engineer and data science student driven by curiosity about how systems work at every level. I build games, tools, and applications while diving deep into the underlying technologies. I'm passionate about solving complex problems across different domains and creating software that delivers real value.</w:t>
-      </w:r>
-    </w:p>
-    <w:p>
-      <w:pPr>
-        <w:spacing w:before="280" w:after="80"/>
-        <w:pBdr>
-          <w:bottom w:val="single" w:sz="6" w:space="4" w:color="444444"/>
-        </w:pBdr>
-      </w:pPr>
-      <w:r>
-        <w:rPr>
-          <w:b/>
-          <w:color w:val="222222"/>
-          <w:sz w:val="22"/>
-        </w:rPr>
-        <w:t>SKILLS</w:t>
-      </w:r>
-    </w:p>
-    <w:p>
-      <w:pPr>
-        <w:spacing w:after="60"/>
-      </w:pPr>
-      <w:r>
-        <w:rPr>
-          <w:b/>
-        </w:rPr>
-        <w:t xml:space="preserve">Programming Languages: </w:t>
-      </w:r>
-      <w:r>
-        <w:t>C#, C/C++, Assembly, Python, Java, Javascript, HTML/CSS, Dart, SQL</w:t>
-      </w:r>
-    </w:p>
-    <w:p>
-      <w:pPr>
-        <w:spacing w:after="60"/>
-      </w:pPr>
-      <w:r>
-        <w:rPr>
-          <w:b/>
-        </w:rPr>
-        <w:t xml:space="preserve">Game Development: </w:t>
-      </w:r>
-      <w:r>
-        <w:t>Unity, Godot, Monogame, Raylib, Sokol</w:t>
-      </w:r>
-    </w:p>
-    <w:p>
-      <w:pPr>
-        <w:spacing w:after="60"/>
-      </w:pPr>
-      <w:r>
-        <w:rPr>
-          <w:b/>
-        </w:rPr>
-        <w:t xml:space="preserve">Web Development: </w:t>
-      </w:r>
-      <w:r>
-        <w:t>ASP.NET, Django, Flask, Angular, React, Nextjs</w:t>
-      </w:r>
-    </w:p>
-    <w:p>
-      <w:pPr>
-        <w:spacing w:after="60"/>
-      </w:pPr>
-      <w:r>
-        <w:rPr>
-          <w:b/>
-        </w:rPr>
-        <w:t xml:space="preserve">Mobile Development: </w:t>
-      </w:r>
-      <w:r>
-        <w:t>Flutter, React Native</w:t>
-      </w:r>
-    </w:p>
-    <w:p>
-      <w:pPr>
-        <w:spacing w:after="60"/>
-      </w:pPr>
-      <w:r>
-        <w:rPr>
-          <w:b/>
-        </w:rPr>
-        <w:t xml:space="preserve">Machine Learning: </w:t>
-      </w:r>
-      <w:r>
-        <w:t>PyTorch, TensorFlow, Scikit-learn, Langchain</w:t>
-      </w:r>
-    </w:p>
-    <w:p>
-      <w:pPr>
-        <w:spacing w:after="60"/>
-      </w:pPr>
-      <w:r>
-        <w:rPr>
-          <w:b/>
-        </w:rPr>
-        <w:t xml:space="preserve">Data &amp; Analytics: </w:t>
-      </w:r>
-      <w:r>
-        <w:t>Pandas, NumPy, Power BI, Row-Level Security</w:t>
-      </w:r>
-    </w:p>
-    <w:p>
-      <w:pPr>
-        <w:spacing w:after="60"/>
-      </w:pPr>
-      <w:r>
-        <w:rPr>
-          <w:b/>
-        </w:rPr>
-        <w:t xml:space="preserve">Tools &amp; DevOps: </w:t>
-      </w:r>
-      <w:r>
-        <w:t>Git, GitHub, Docker, Linux, Blender, REST APIs, CI/CD, Netlify, Render, Photoshop, Figma</w:t>
       </w:r>
     </w:p>
     <w:p>
@@ -580,6 +466,283 @@
           <w:color w:val="222222"/>
           <w:sz w:val="22"/>
         </w:rPr>
+        <w:t>FEATURED PROJECTS</w:t>
+      </w:r>
+    </w:p>
+    <w:p>
+      <w:pPr>
+        <w:spacing w:before="120" w:after="20"/>
+      </w:pPr>
+      <w:hyperlink r:id="rId17">
+        <w:r>
+          <w:rPr>
+            <w:rStyle w:val="Hyperlink"/>
+            <w:sz w:val="20"/>
+          </w:rPr>
+          <w:t>CORM</w:t>
+        </w:r>
+      </w:hyperlink>
+    </w:p>
+    <w:p>
+      <w:pPr>
+        <w:spacing w:after="40"/>
+      </w:pPr>
+      <w:r>
+        <w:rPr>
+          <w:i/>
+          <w:color w:val="666666"/>
+        </w:rPr>
+        <w:t>C, ORM, SQL, Library</w:t>
+      </w:r>
+    </w:p>
+    <w:p>
+      <w:pPr>
+        <w:pStyle w:val="ListBullet"/>
+        <w:spacing w:after="20"/>
+      </w:pPr>
+      <w:hyperlink r:id="rId18">
+        <w:r>
+          <w:rPr>
+            <w:rStyle w:val="Hyperlink"/>
+            <w:sz w:val="20"/>
+          </w:rPr>
+          <w:t>Github (Source Code)</w:t>
+        </w:r>
+      </w:hyperlink>
+    </w:p>
+    <w:p>
+      <w:pPr>
+        <w:spacing w:before="120" w:after="20"/>
+      </w:pPr>
+      <w:hyperlink r:id="rId19">
+        <w:r>
+          <w:rPr>
+            <w:rStyle w:val="Hyperlink"/>
+            <w:sz w:val="20"/>
+          </w:rPr>
+          <w:t>MentAI</w:t>
+        </w:r>
+      </w:hyperlink>
+    </w:p>
+    <w:p>
+      <w:pPr>
+        <w:spacing w:after="40"/>
+      </w:pPr>
+      <w:r>
+        <w:rPr>
+          <w:i/>
+          <w:color w:val="666666"/>
+        </w:rPr>
+        <w:t>AI Health Assistant, Web Application, Django, Python, Langchain, Multi-Agent AI, Javascript, HTMX, HTML/CSS, Tailwind</w:t>
+      </w:r>
+    </w:p>
+    <w:p>
+      <w:pPr>
+        <w:pStyle w:val="ListBullet"/>
+        <w:spacing w:after="20"/>
+      </w:pPr>
+      <w:hyperlink r:id="rId20">
+        <w:r>
+          <w:rPr>
+            <w:rStyle w:val="Hyperlink"/>
+            <w:sz w:val="20"/>
+          </w:rPr>
+          <w:t>Github Repo</w:t>
+        </w:r>
+      </w:hyperlink>
+    </w:p>
+    <w:p>
+      <w:pPr>
+        <w:spacing w:before="120" w:after="20"/>
+      </w:pPr>
+      <w:hyperlink r:id="rId21">
+        <w:r>
+          <w:rPr>
+            <w:rStyle w:val="Hyperlink"/>
+            <w:sz w:val="20"/>
+          </w:rPr>
+          <w:t>rAIs</w:t>
+        </w:r>
+      </w:hyperlink>
+    </w:p>
+    <w:p>
+      <w:pPr>
+        <w:spacing w:after="40"/>
+      </w:pPr>
+      <w:r>
+        <w:rPr>
+          <w:i/>
+          <w:color w:val="666666"/>
+        </w:rPr>
+        <w:t>3D Interactive, Artificial Intelligence, Unity, Python, C#, Blender, RAG, Langchain, Photoshop</w:t>
+      </w:r>
+    </w:p>
+    <w:p>
+      <w:pPr>
+        <w:spacing w:before="120" w:after="20"/>
+      </w:pPr>
+      <w:hyperlink r:id="rId22">
+        <w:r>
+          <w:rPr>
+            <w:rStyle w:val="Hyperlink"/>
+            <w:sz w:val="20"/>
+          </w:rPr>
+          <w:t>Rental Property Manager</w:t>
+        </w:r>
+      </w:hyperlink>
+    </w:p>
+    <w:p>
+      <w:pPr>
+        <w:spacing w:after="40"/>
+      </w:pPr>
+      <w:r>
+        <w:rPr>
+          <w:i/>
+          <w:color w:val="666666"/>
+        </w:rPr>
+        <w:t>React Native, Expo, Typescript, Supabase, CI/CD, Mobile</w:t>
+      </w:r>
+    </w:p>
+    <w:p>
+      <w:pPr>
+        <w:pStyle w:val="ListBullet"/>
+        <w:spacing w:after="20"/>
+      </w:pPr>
+      <w:hyperlink r:id="rId23">
+        <w:r>
+          <w:rPr>
+            <w:rStyle w:val="Hyperlink"/>
+            <w:sz w:val="20"/>
+          </w:rPr>
+          <w:t>Github (Source Code)</w:t>
+        </w:r>
+      </w:hyperlink>
+    </w:p>
+    <w:p>
+      <w:pPr>
+        <w:spacing w:before="120" w:after="20"/>
+      </w:pPr>
+      <w:hyperlink r:id="rId24">
+        <w:r>
+          <w:rPr>
+            <w:rStyle w:val="Hyperlink"/>
+            <w:sz w:val="20"/>
+          </w:rPr>
+          <w:t>Stock Boy</w:t>
+        </w:r>
+      </w:hyperlink>
+    </w:p>
+    <w:p>
+      <w:pPr>
+        <w:spacing w:after="40"/>
+      </w:pPr>
+      <w:r>
+        <w:rPr>
+          <w:i/>
+          <w:color w:val="666666"/>
+        </w:rPr>
+        <w:t>2D Game, Unity, C#</w:t>
+      </w:r>
+    </w:p>
+    <w:p>
+      <w:pPr>
+        <w:pStyle w:val="ListBullet"/>
+        <w:spacing w:after="20"/>
+      </w:pPr>
+      <w:hyperlink r:id="rId25">
+        <w:r>
+          <w:rPr>
+            <w:rStyle w:val="Hyperlink"/>
+            <w:sz w:val="20"/>
+          </w:rPr>
+          <w:t>Website</w:t>
+        </w:r>
+      </w:hyperlink>
+    </w:p>
+    <w:p>
+      <w:pPr>
+        <w:pStyle w:val="ListBullet"/>
+        <w:spacing w:after="20"/>
+      </w:pPr>
+      <w:hyperlink r:id="rId15">
+        <w:r>
+          <w:rPr>
+            <w:rStyle w:val="Hyperlink"/>
+            <w:sz w:val="20"/>
+          </w:rPr>
+          <w:t>Itch (Play Demo)</w:t>
+        </w:r>
+      </w:hyperlink>
+    </w:p>
+    <w:p>
+      <w:pPr>
+        <w:spacing w:before="120" w:after="20"/>
+      </w:pPr>
+      <w:hyperlink r:id="rId26">
+        <w:r>
+          <w:rPr>
+            <w:rStyle w:val="Hyperlink"/>
+            <w:sz w:val="20"/>
+          </w:rPr>
+          <w:t>The Lost Hope</w:t>
+        </w:r>
+      </w:hyperlink>
+    </w:p>
+    <w:p>
+      <w:pPr>
+        <w:spacing w:after="40"/>
+      </w:pPr>
+      <w:r>
+        <w:rPr>
+          <w:i/>
+          <w:color w:val="666666"/>
+        </w:rPr>
+        <w:t>2D Game, Monogame, C#</w:t>
+      </w:r>
+    </w:p>
+    <w:p>
+      <w:pPr>
+        <w:pStyle w:val="ListBullet"/>
+        <w:spacing w:after="20"/>
+      </w:pPr>
+      <w:hyperlink r:id="rId27">
+        <w:r>
+          <w:rPr>
+            <w:rStyle w:val="Hyperlink"/>
+            <w:sz w:val="20"/>
+          </w:rPr>
+          <w:t>Github (Source Code)</w:t>
+        </w:r>
+      </w:hyperlink>
+    </w:p>
+    <w:p>
+      <w:pPr>
+        <w:pStyle w:val="ListBullet"/>
+        <w:spacing w:after="20"/>
+      </w:pPr>
+      <w:hyperlink r:id="rId28">
+        <w:r>
+          <w:rPr>
+            <w:rStyle w:val="Hyperlink"/>
+            <w:sz w:val="20"/>
+          </w:rPr>
+          <w:t>Youtube Devlog Series</w:t>
+        </w:r>
+      </w:hyperlink>
+    </w:p>
+    <w:p>
+      <w:pPr>
+        <w:spacing w:before="280" w:after="80"/>
+        <w:pBdr>
+          <w:bottom w:val="single" w:sz="6" w:space="4" w:color="444444"/>
+        </w:pBdr>
+      </w:pPr>
+      <w:r>
+        <w:rPr>
+          <w:b/>
+          <w:color w:val="222222"/>
+          <w:sz w:val="22"/>
+        </w:rPr>
         <w:t>VOLUNTEERING</w:t>
       </w:r>
     </w:p>
@@ -623,7 +786,7 @@
         <w:pStyle w:val="ListBullet"/>
         <w:spacing w:after="20"/>
       </w:pPr>
-      <w:hyperlink r:id="rId17">
+      <w:hyperlink r:id="rId29">
         <w:r>
           <w:rPr>
             <w:rStyle w:val="Hyperlink"/>
@@ -701,6 +864,120 @@
           <w:i w:val="0"/>
         </w:rPr>
         <w:t>Managed and maintained the Tek-up IEEE Student Branch Computer Society chapter website and social medias, handling content updates, technical maintenance, and digital communications.</w:t>
+      </w:r>
+    </w:p>
+    <w:p>
+      <w:pPr>
+        <w:spacing w:before="280" w:after="80"/>
+        <w:pBdr>
+          <w:bottom w:val="single" w:sz="6" w:space="4" w:color="444444"/>
+        </w:pBdr>
+      </w:pPr>
+      <w:r>
+        <w:rPr>
+          <w:b/>
+          <w:color w:val="222222"/>
+          <w:sz w:val="22"/>
+        </w:rPr>
+        <w:t>SKILLS</w:t>
+      </w:r>
+    </w:p>
+    <w:p>
+      <w:pPr>
+        <w:spacing w:after="60"/>
+      </w:pPr>
+      <w:r>
+        <w:rPr>
+          <w:b/>
+        </w:rPr>
+        <w:t xml:space="preserve">Programming Languages: </w:t>
+      </w:r>
+      <w:r>
+        <w:t>C#, C, Assembly, Python, Java, Javascript, Typescript, HTML/CSS, Dart, SQL</w:t>
+      </w:r>
+    </w:p>
+    <w:p>
+      <w:pPr>
+        <w:spacing w:after="60"/>
+      </w:pPr>
+      <w:r>
+        <w:rPr>
+          <w:b/>
+        </w:rPr>
+        <w:t xml:space="preserve">Game Development: </w:t>
+      </w:r>
+      <w:r>
+        <w:t>Unity, Godot, Monogame, Raylib, Sokol</w:t>
+      </w:r>
+    </w:p>
+    <w:p>
+      <w:pPr>
+        <w:spacing w:after="60"/>
+      </w:pPr>
+      <w:r>
+        <w:rPr>
+          <w:b/>
+        </w:rPr>
+        <w:t xml:space="preserve">Web Development: </w:t>
+      </w:r>
+      <w:r>
+        <w:t>ASP.NET, Django, Flask, Angular, React, Nextjs</w:t>
+      </w:r>
+    </w:p>
+    <w:p>
+      <w:pPr>
+        <w:spacing w:after="60"/>
+      </w:pPr>
+      <w:r>
+        <w:rPr>
+          <w:b/>
+        </w:rPr>
+        <w:t xml:space="preserve">Mobile Development: </w:t>
+      </w:r>
+      <w:r>
+        <w:t>Flutter, React Native, Expo</w:t>
+      </w:r>
+    </w:p>
+    <w:p>
+      <w:pPr>
+        <w:spacing w:after="60"/>
+      </w:pPr>
+      <w:r>
+        <w:rPr>
+          <w:b/>
+        </w:rPr>
+        <w:t xml:space="preserve">Machine Learning: </w:t>
+      </w:r>
+      <w:r>
+        <w:t>PyTorch, TensorFlow, Scikit-learn, Langchain, NLP</w:t>
+      </w:r>
+    </w:p>
+    <w:p>
+      <w:pPr>
+        <w:spacing w:after="60"/>
+      </w:pPr>
+      <w:r>
+        <w:rPr>
+          <w:b/>
+        </w:rPr>
+        <w:t xml:space="preserve">Data &amp; Analytics: </w:t>
+      </w:r>
+      <w:r>
+        <w:t>Pandas, NumPy, Power BI, Row-Level Security</w:t>
+      </w:r>
+    </w:p>
+    <w:p>
+      <w:pPr>
+        <w:spacing w:after="60"/>
+      </w:pPr>
+      <w:r>
+        <w:rPr>
+          <w:b/>
+        </w:rPr>
+        <w:t xml:space="preserve">Tools &amp; DevOps: </w:t>
+      </w:r>
+      <w:r>
+        <w:t>Git, GitHub, Docker, Linux, Blender, REST APIs, CI/CD, Netlify, Render, Photoshop, Figma</w:t>
       </w:r>
     </w:p>
     <w:sectPr>

</xml_diff>

<commit_message>
feat: add internship project details
Added a new project page for the internship HRMS platform, including a description, screenshots, and links to the internship report and source code.
</commit_message>
<xml_diff>
--- a/assets/files/Amen_Allah_Ben_Aissa_CV.docx
+++ b/assets/files/Amen_Allah_Ben_Aissa_CV.docx
@@ -204,6 +204,51 @@
     </w:p>
     <w:p>
       <w:pPr>
+        <w:pStyle w:val="ListBullet"/>
+        <w:spacing w:after="20"/>
+      </w:pPr>
+      <w:hyperlink r:id="rId13">
+        <w:r>
+          <w:rPr>
+            <w:rStyle w:val="Hyperlink"/>
+            <w:sz w:val="20"/>
+          </w:rPr>
+          <w:t>Square-IT</w:t>
+        </w:r>
+      </w:hyperlink>
+    </w:p>
+    <w:p>
+      <w:pPr>
+        <w:pStyle w:val="ListBullet"/>
+        <w:spacing w:after="20"/>
+      </w:pPr>
+      <w:hyperlink r:id="rId14">
+        <w:r>
+          <w:rPr>
+            <w:rStyle w:val="Hyperlink"/>
+            <w:sz w:val="20"/>
+          </w:rPr>
+          <w:t>Project Page</w:t>
+        </w:r>
+      </w:hyperlink>
+    </w:p>
+    <w:p>
+      <w:pPr>
+        <w:pStyle w:val="ListBullet"/>
+        <w:spacing w:after="20"/>
+      </w:pPr>
+      <w:hyperlink r:id="rId15">
+        <w:r>
+          <w:rPr>
+            <w:rStyle w:val="Hyperlink"/>
+            <w:sz w:val="20"/>
+          </w:rPr>
+          <w:t>Internship Report</w:t>
+        </w:r>
+      </w:hyperlink>
+    </w:p>
+    <w:p>
+      <w:pPr>
         <w:spacing w:before="120" w:after="20"/>
       </w:pPr>
       <w:r>
@@ -242,7 +287,7 @@
         <w:pStyle w:val="ListBullet"/>
         <w:spacing w:after="20"/>
       </w:pPr>
-      <w:hyperlink r:id="rId13">
+      <w:hyperlink r:id="rId16">
         <w:r>
           <w:rPr>
             <w:rStyle w:val="Hyperlink"/>
@@ -257,7 +302,7 @@
         <w:pStyle w:val="ListBullet"/>
         <w:spacing w:after="20"/>
       </w:pPr>
-      <w:hyperlink r:id="rId14">
+      <w:hyperlink r:id="rId17">
         <w:r>
           <w:rPr>
             <w:rStyle w:val="Hyperlink"/>
@@ -307,7 +352,7 @@
         <w:pStyle w:val="ListBullet"/>
         <w:spacing w:after="20"/>
       </w:pPr>
-      <w:hyperlink r:id="rId15">
+      <w:hyperlink r:id="rId18">
         <w:r>
           <w:rPr>
             <w:rStyle w:val="Hyperlink"/>
@@ -357,7 +402,7 @@
         <w:pStyle w:val="ListBullet"/>
         <w:spacing w:after="20"/>
       </w:pPr>
-      <w:hyperlink r:id="rId16">
+      <w:hyperlink r:id="rId19">
         <w:r>
           <w:rPr>
             <w:rStyle w:val="Hyperlink"/>
@@ -473,7 +518,7 @@
       <w:pPr>
         <w:spacing w:before="120" w:after="20"/>
       </w:pPr>
-      <w:hyperlink r:id="rId17">
+      <w:hyperlink r:id="rId20">
         <w:r>
           <w:rPr>
             <w:rStyle w:val="Hyperlink"/>
@@ -500,7 +545,7 @@
         <w:pStyle w:val="ListBullet"/>
         <w:spacing w:after="20"/>
       </w:pPr>
-      <w:hyperlink r:id="rId18">
+      <w:hyperlink r:id="rId21">
         <w:r>
           <w:rPr>
             <w:rStyle w:val="Hyperlink"/>
@@ -514,7 +559,7 @@
       <w:pPr>
         <w:spacing w:before="120" w:after="20"/>
       </w:pPr>
-      <w:hyperlink r:id="rId19">
+      <w:hyperlink r:id="rId22">
         <w:r>
           <w:rPr>
             <w:rStyle w:val="Hyperlink"/>
@@ -541,7 +586,7 @@
         <w:pStyle w:val="ListBullet"/>
         <w:spacing w:after="20"/>
       </w:pPr>
-      <w:hyperlink r:id="rId20">
+      <w:hyperlink r:id="rId23">
         <w:r>
           <w:rPr>
             <w:rStyle w:val="Hyperlink"/>
@@ -555,7 +600,7 @@
       <w:pPr>
         <w:spacing w:before="120" w:after="20"/>
       </w:pPr>
-      <w:hyperlink r:id="rId21">
+      <w:hyperlink r:id="rId24">
         <w:r>
           <w:rPr>
             <w:rStyle w:val="Hyperlink"/>
@@ -581,7 +626,7 @@
       <w:pPr>
         <w:spacing w:before="120" w:after="20"/>
       </w:pPr>
-      <w:hyperlink r:id="rId22">
+      <w:hyperlink r:id="rId25">
         <w:r>
           <w:rPr>
             <w:rStyle w:val="Hyperlink"/>
@@ -608,7 +653,7 @@
         <w:pStyle w:val="ListBullet"/>
         <w:spacing w:after="20"/>
       </w:pPr>
-      <w:hyperlink r:id="rId23">
+      <w:hyperlink r:id="rId26">
         <w:r>
           <w:rPr>
             <w:rStyle w:val="Hyperlink"/>
@@ -622,7 +667,7 @@
       <w:pPr>
         <w:spacing w:before="120" w:after="20"/>
       </w:pPr>
-      <w:hyperlink r:id="rId24">
+      <w:hyperlink r:id="rId27">
         <w:r>
           <w:rPr>
             <w:rStyle w:val="Hyperlink"/>
@@ -649,7 +694,7 @@
         <w:pStyle w:val="ListBullet"/>
         <w:spacing w:after="20"/>
       </w:pPr>
-      <w:hyperlink r:id="rId25">
+      <w:hyperlink r:id="rId28">
         <w:r>
           <w:rPr>
             <w:rStyle w:val="Hyperlink"/>
@@ -664,7 +709,7 @@
         <w:pStyle w:val="ListBullet"/>
         <w:spacing w:after="20"/>
       </w:pPr>
-      <w:hyperlink r:id="rId15">
+      <w:hyperlink r:id="rId18">
         <w:r>
           <w:rPr>
             <w:rStyle w:val="Hyperlink"/>
@@ -678,7 +723,7 @@
       <w:pPr>
         <w:spacing w:before="120" w:after="20"/>
       </w:pPr>
-      <w:hyperlink r:id="rId26">
+      <w:hyperlink r:id="rId29">
         <w:r>
           <w:rPr>
             <w:rStyle w:val="Hyperlink"/>
@@ -705,7 +750,7 @@
         <w:pStyle w:val="ListBullet"/>
         <w:spacing w:after="20"/>
       </w:pPr>
-      <w:hyperlink r:id="rId27">
+      <w:hyperlink r:id="rId30">
         <w:r>
           <w:rPr>
             <w:rStyle w:val="Hyperlink"/>
@@ -720,7 +765,7 @@
         <w:pStyle w:val="ListBullet"/>
         <w:spacing w:after="20"/>
       </w:pPr>
-      <w:hyperlink r:id="rId28">
+      <w:hyperlink r:id="rId31">
         <w:r>
           <w:rPr>
             <w:rStyle w:val="Hyperlink"/>
@@ -786,7 +831,7 @@
         <w:pStyle w:val="ListBullet"/>
         <w:spacing w:after="20"/>
       </w:pPr>
-      <w:hyperlink r:id="rId29">
+      <w:hyperlink r:id="rId32">
         <w:r>
           <w:rPr>
             <w:rStyle w:val="Hyperlink"/>

</xml_diff>

<commit_message>
feat: update education dates
Removed outdated education period to reflect current status and accuracy.
</commit_message>
<xml_diff>
--- a/assets/files/Amen_Allah_Ben_Aissa_CV.docx
+++ b/assets/files/Amen_Allah_Ben_Aissa_CV.docx
@@ -448,7 +448,7 @@
           <w:i/>
           <w:color w:val="666666"/>
         </w:rPr>
-        <w:t>2023 - Present</w:t>
+        <w:t>2023 - 2026</w:t>
       </w:r>
     </w:p>
     <w:p>
@@ -483,7 +483,7 @@
           <w:i/>
           <w:color w:val="666666"/>
         </w:rPr>
-        <w:t>2020 - 2024</w:t>
+        <w:t>2020 - 2023</w:t>
       </w:r>
     </w:p>
     <w:p>

</xml_diff>